<commit_message>
Theme selector (Harvest/Big Sky/Sage); sermon-note hints from underlined answers in the docx; empty notes state links to converted weeks
</commit_message>
<xml_diff>
--- a/notes-inbox/2026-10-04-bridesmaids.docx
+++ b/notes-inbox/2026-10-04-bridesmaids.docx
@@ -240,73 +240,14 @@
       </w:r>
       <w:r>
         <w:rPr>
+          <w:u w:val="single"/>
           <w:rFonts w:cs="Calibri"/>
           <w:b/>
           <w:bCs/>
           <w:sz w:val="28"/>
           <w:szCs w:val="28"/>
         </w:rPr>
-        <w:t>________</w:t>
-      </w:r>
-      <w:r>
-        <w:rPr>
-          <w:rFonts w:cs="Calibri"/>
-          <w:b/>
-          <w:bCs/>
-          <w:sz w:val="28"/>
-          <w:szCs w:val="28"/>
-        </w:rPr>
-        <w:t>___</w:t>
-      </w:r>
-      <w:r>
-        <w:rPr>
-          <w:rFonts w:cs="Calibri"/>
-          <w:b/>
-          <w:bCs/>
-          <w:sz w:val="28"/>
-          <w:szCs w:val="28"/>
-        </w:rPr>
-        <w:t>_</w:t>
-      </w:r>
-      <w:r>
-        <w:rPr>
-          <w:rFonts w:cs="Calibri"/>
-          <w:b/>
-          <w:bCs/>
-          <w:sz w:val="28"/>
-          <w:szCs w:val="28"/>
-        </w:rPr>
-        <w:t>_________</w:t>
-      </w:r>
-      <w:r>
-        <w:rPr>
-          <w:rFonts w:cs="Calibri"/>
-          <w:b/>
-          <w:bCs/>
-          <w:sz w:val="28"/>
-          <w:szCs w:val="28"/>
-        </w:rPr>
-        <w:t>_</w:t>
-      </w:r>
-      <w:r>
-        <w:rPr>
-          <w:rFonts w:cs="Calibri"/>
-          <w:b/>
-          <w:bCs/>
-          <w:sz w:val="28"/>
-          <w:szCs w:val="28"/>
-        </w:rPr>
-        <w:t>_____</w:t>
-      </w:r>
-      <w:r>
-        <w:rPr>
-          <w:rFonts w:cs="Calibri"/>
-          <w:b/>
-          <w:bCs/>
-          <w:sz w:val="28"/>
-          <w:szCs w:val="28"/>
-        </w:rPr>
-        <w:t>___</w:t>
+        <w:t xml:space="preserve">King</w:t>
       </w:r>
       <w:r>
         <w:rPr>
@@ -374,73 +315,14 @@
       </w:r>
       <w:r>
         <w:rPr>
+          <w:u w:val="single"/>
           <w:rFonts w:cs="Calibri"/>
           <w:b/>
           <w:bCs/>
           <w:sz w:val="28"/>
           <w:szCs w:val="28"/>
         </w:rPr>
-        <w:t>________</w:t>
-      </w:r>
-      <w:r>
-        <w:rPr>
-          <w:rFonts w:cs="Calibri"/>
-          <w:b/>
-          <w:bCs/>
-          <w:sz w:val="28"/>
-          <w:szCs w:val="28"/>
-        </w:rPr>
-        <w:t>___</w:t>
-      </w:r>
-      <w:r>
-        <w:rPr>
-          <w:rFonts w:cs="Calibri"/>
-          <w:b/>
-          <w:bCs/>
-          <w:sz w:val="28"/>
-          <w:szCs w:val="28"/>
-        </w:rPr>
-        <w:t>_</w:t>
-      </w:r>
-      <w:r>
-        <w:rPr>
-          <w:rFonts w:cs="Calibri"/>
-          <w:b/>
-          <w:bCs/>
-          <w:sz w:val="28"/>
-          <w:szCs w:val="28"/>
-        </w:rPr>
-        <w:t>_________</w:t>
-      </w:r>
-      <w:r>
-        <w:rPr>
-          <w:rFonts w:cs="Calibri"/>
-          <w:b/>
-          <w:bCs/>
-          <w:sz w:val="28"/>
-          <w:szCs w:val="28"/>
-        </w:rPr>
-        <w:t>_</w:t>
-      </w:r>
-      <w:r>
-        <w:rPr>
-          <w:rFonts w:cs="Calibri"/>
-          <w:b/>
-          <w:bCs/>
-          <w:sz w:val="28"/>
-          <w:szCs w:val="28"/>
-        </w:rPr>
-        <w:t>_____</w:t>
-      </w:r>
-      <w:r>
-        <w:rPr>
-          <w:rFonts w:cs="Calibri"/>
-          <w:b/>
-          <w:bCs/>
-          <w:sz w:val="28"/>
-          <w:szCs w:val="28"/>
-        </w:rPr>
-        <w:t>___</w:t>
+        <w:t xml:space="preserve">no to others</w:t>
       </w:r>
       <w:r>
         <w:rPr>
@@ -508,73 +390,14 @@
       </w:r>
       <w:r>
         <w:rPr>
+          <w:u w:val="single"/>
           <w:rFonts w:cs="Calibri"/>
           <w:b/>
           <w:bCs/>
           <w:sz w:val="28"/>
           <w:szCs w:val="28"/>
         </w:rPr>
-        <w:t>________</w:t>
-      </w:r>
-      <w:r>
-        <w:rPr>
-          <w:rFonts w:cs="Calibri"/>
-          <w:b/>
-          <w:bCs/>
-          <w:sz w:val="28"/>
-          <w:szCs w:val="28"/>
-        </w:rPr>
-        <w:t>___</w:t>
-      </w:r>
-      <w:r>
-        <w:rPr>
-          <w:rFonts w:cs="Calibri"/>
-          <w:b/>
-          <w:bCs/>
-          <w:sz w:val="28"/>
-          <w:szCs w:val="28"/>
-        </w:rPr>
-        <w:t>_</w:t>
-      </w:r>
-      <w:r>
-        <w:rPr>
-          <w:rFonts w:cs="Calibri"/>
-          <w:b/>
-          <w:bCs/>
-          <w:sz w:val="28"/>
-          <w:szCs w:val="28"/>
-        </w:rPr>
-        <w:t>_________</w:t>
-      </w:r>
-      <w:r>
-        <w:rPr>
-          <w:rFonts w:cs="Calibri"/>
-          <w:b/>
-          <w:bCs/>
-          <w:sz w:val="28"/>
-          <w:szCs w:val="28"/>
-        </w:rPr>
-        <w:t>_</w:t>
-      </w:r>
-      <w:r>
-        <w:rPr>
-          <w:rFonts w:cs="Calibri"/>
-          <w:b/>
-          <w:bCs/>
-          <w:sz w:val="28"/>
-          <w:szCs w:val="28"/>
-        </w:rPr>
-        <w:t>_____</w:t>
-      </w:r>
-      <w:r>
-        <w:rPr>
-          <w:rFonts w:cs="Calibri"/>
-          <w:b/>
-          <w:bCs/>
-          <w:sz w:val="28"/>
-          <w:szCs w:val="28"/>
-        </w:rPr>
-        <w:t>___</w:t>
+        <w:t xml:space="preserve">actions</w:t>
       </w:r>
       <w:r>
         <w:rPr>
@@ -646,73 +469,14 @@
       </w:r>
       <w:r>
         <w:rPr>
+          <w:u w:val="single"/>
           <w:rFonts w:cs="Calibri"/>
           <w:b/>
           <w:bCs/>
           <w:sz w:val="28"/>
           <w:szCs w:val="28"/>
         </w:rPr>
-        <w:t>________</w:t>
-      </w:r>
-      <w:r>
-        <w:rPr>
-          <w:rFonts w:cs="Calibri"/>
-          <w:b/>
-          <w:bCs/>
-          <w:sz w:val="28"/>
-          <w:szCs w:val="28"/>
-        </w:rPr>
-        <w:t>___</w:t>
-      </w:r>
-      <w:r>
-        <w:rPr>
-          <w:rFonts w:cs="Calibri"/>
-          <w:b/>
-          <w:bCs/>
-          <w:sz w:val="28"/>
-          <w:szCs w:val="28"/>
-        </w:rPr>
-        <w:t>_</w:t>
-      </w:r>
-      <w:r>
-        <w:rPr>
-          <w:rFonts w:cs="Calibri"/>
-          <w:b/>
-          <w:bCs/>
-          <w:sz w:val="28"/>
-          <w:szCs w:val="28"/>
-        </w:rPr>
-        <w:t>_________</w:t>
-      </w:r>
-      <w:r>
-        <w:rPr>
-          <w:rFonts w:cs="Calibri"/>
-          <w:b/>
-          <w:bCs/>
-          <w:sz w:val="28"/>
-          <w:szCs w:val="28"/>
-        </w:rPr>
-        <w:t>_</w:t>
-      </w:r>
-      <w:r>
-        <w:rPr>
-          <w:rFonts w:cs="Calibri"/>
-          <w:b/>
-          <w:bCs/>
-          <w:sz w:val="28"/>
-          <w:szCs w:val="28"/>
-        </w:rPr>
-        <w:t>_____</w:t>
-      </w:r>
-      <w:r>
-        <w:rPr>
-          <w:rFonts w:cs="Calibri"/>
-          <w:b/>
-          <w:bCs/>
-          <w:sz w:val="28"/>
-          <w:szCs w:val="28"/>
-        </w:rPr>
-        <w:t>___</w:t>
+        <w:t xml:space="preserve">judgment</w:t>
       </w:r>
       <w:r>
         <w:rPr>

</xml_diff>